<commit_message>
Met à jour les formulaires d'engagement pilote de la Coupe de France
Remplace les fichiers PDF et Word du formulaire d'engagement pilote de la
Coupe de France des Circuits par les nouvelles versions (V1). Les intitulés
et liens sur le site restent inchangés.

Co-Authored-By: Claude Opus 4.8 <noreply@anthropic.com>
Claude-Session: https://claude.ai/code/session_01RTCjdER9RQ5NfQavLzosnT
</commit_message>
<xml_diff>
--- a/assets/documents/formulaire-engagement-coupe-de-france-2026.docx
+++ b/assets/documents/formulaire-engagement-coupe-de-france-2026.docx
@@ -1699,6 +1699,7 @@
                                   <w:sz w:val="18"/>
                                 </w:rPr>
                               </w:pPr>
+                              <w:proofErr w:type="gramStart"/>
                               <w:r>
                                 <w:rPr>
                                   <w:rFonts w:ascii="Arial Black"/>
@@ -1707,6 +1708,7 @@
                                 </w:rPr>
                                 <w:t>E-Mail</w:t>
                               </w:r>
+                              <w:proofErr w:type="gramEnd"/>
                               <w:r>
                                 <w:rPr>
                                   <w:rFonts w:ascii="Arial Black"/>
@@ -1849,59 +1851,6 @@
                                   <w:color w:val="000000"/>
                                 </w:rPr>
                               </w:pPr>
-                              <w:r>
-                                <w:rPr>
-                                  <w:rFonts w:ascii="Arial MT"/>
-                                  <w:color w:val="000000"/>
-                                </w:rPr>
-                                <w:t>Choix</w:t>
-                              </w:r>
-                              <w:r>
-                                <w:rPr>
-                                  <w:rFonts w:ascii="Arial MT"/>
-                                  <w:color w:val="000000"/>
-                                  <w:spacing w:val="-9"/>
-                                </w:rPr>
-                                <w:t xml:space="preserve"> </w:t>
-                              </w:r>
-                              <w:r>
-                                <w:rPr>
-                                  <w:rFonts w:ascii="Arial MT"/>
-                                  <w:color w:val="000000"/>
-                                </w:rPr>
-                                <w:t>Groupe</w:t>
-                              </w:r>
-                              <w:r>
-                                <w:rPr>
-                                  <w:rFonts w:ascii="Arial MT"/>
-                                  <w:color w:val="000000"/>
-                                  <w:spacing w:val="-9"/>
-                                </w:rPr>
-                                <w:t xml:space="preserve"> </w:t>
-                              </w:r>
-                              <w:r>
-                                <w:rPr>
-                                  <w:rFonts w:ascii="Arial MT"/>
-                                  <w:color w:val="000000"/>
-                                </w:rPr>
-                                <w:t>&amp;</w:t>
-                              </w:r>
-                              <w:r>
-                                <w:rPr>
-                                  <w:rFonts w:ascii="Arial MT"/>
-                                  <w:color w:val="000000"/>
-                                  <w:spacing w:val="-9"/>
-                                </w:rPr>
-                                <w:t xml:space="preserve"> </w:t>
-                              </w:r>
-                              <w:r>
-                                <w:rPr>
-                                  <w:rFonts w:ascii="Arial MT"/>
-                                  <w:color w:val="000000"/>
-                                  <w:spacing w:val="-2"/>
-                                </w:rPr>
-                                <w:t>Classe</w:t>
-                              </w:r>
                             </w:p>
                           </w:txbxContent>
                         </wps:txbx>
@@ -3337,6 +3286,7 @@
                             <w:sz w:val="18"/>
                           </w:rPr>
                         </w:pPr>
+                        <w:proofErr w:type="gramStart"/>
                         <w:r>
                           <w:rPr>
                             <w:rFonts w:ascii="Arial Black"/>
@@ -3345,6 +3295,7 @@
                           </w:rPr>
                           <w:t>E-Mail</w:t>
                         </w:r>
+                        <w:proofErr w:type="gramEnd"/>
                         <w:r>
                           <w:rPr>
                             <w:rFonts w:ascii="Arial Black"/>
@@ -3456,59 +3407,6 @@
                             <w:color w:val="000000"/>
                           </w:rPr>
                         </w:pPr>
-                        <w:r>
-                          <w:rPr>
-                            <w:rFonts w:ascii="Arial MT"/>
-                            <w:color w:val="000000"/>
-                          </w:rPr>
-                          <w:t>Choix</w:t>
-                        </w:r>
-                        <w:r>
-                          <w:rPr>
-                            <w:rFonts w:ascii="Arial MT"/>
-                            <w:color w:val="000000"/>
-                            <w:spacing w:val="-9"/>
-                          </w:rPr>
-                          <w:t xml:space="preserve"> </w:t>
-                        </w:r>
-                        <w:r>
-                          <w:rPr>
-                            <w:rFonts w:ascii="Arial MT"/>
-                            <w:color w:val="000000"/>
-                          </w:rPr>
-                          <w:t>Groupe</w:t>
-                        </w:r>
-                        <w:r>
-                          <w:rPr>
-                            <w:rFonts w:ascii="Arial MT"/>
-                            <w:color w:val="000000"/>
-                            <w:spacing w:val="-9"/>
-                          </w:rPr>
-                          <w:t xml:space="preserve"> </w:t>
-                        </w:r>
-                        <w:r>
-                          <w:rPr>
-                            <w:rFonts w:ascii="Arial MT"/>
-                            <w:color w:val="000000"/>
-                          </w:rPr>
-                          <w:t>&amp;</w:t>
-                        </w:r>
-                        <w:r>
-                          <w:rPr>
-                            <w:rFonts w:ascii="Arial MT"/>
-                            <w:color w:val="000000"/>
-                            <w:spacing w:val="-9"/>
-                          </w:rPr>
-                          <w:t xml:space="preserve"> </w:t>
-                        </w:r>
-                        <w:r>
-                          <w:rPr>
-                            <w:rFonts w:ascii="Arial MT"/>
-                            <w:color w:val="000000"/>
-                            <w:spacing w:val="-2"/>
-                          </w:rPr>
-                          <w:t>Classe</w:t>
-                        </w:r>
                       </w:p>
                     </w:txbxContent>
                   </v:textbox>
@@ -4252,6 +4150,7 @@
                                   <w:sz w:val="18"/>
                                 </w:rPr>
                               </w:pPr>
+                              <w:proofErr w:type="gramStart"/>
                               <w:r>
                                 <w:rPr>
                                   <w:rFonts w:ascii="Arial Black"/>
@@ -4260,6 +4159,7 @@
                                 </w:rPr>
                                 <w:t>E-Mail</w:t>
                               </w:r>
+                              <w:proofErr w:type="gramEnd"/>
                               <w:r>
                                 <w:rPr>
                                   <w:rFonts w:ascii="Arial Black"/>
@@ -4777,6 +4677,7 @@
                             <w:sz w:val="18"/>
                           </w:rPr>
                         </w:pPr>
+                        <w:proofErr w:type="gramStart"/>
                         <w:r>
                           <w:rPr>
                             <w:rFonts w:ascii="Arial Black"/>
@@ -4785,6 +4686,7 @@
                           </w:rPr>
                           <w:t>E-Mail</w:t>
                         </w:r>
+                        <w:proofErr w:type="gramEnd"/>
                         <w:r>
                           <w:rPr>
                             <w:rFonts w:ascii="Arial Black"/>
@@ -5325,6 +5227,7 @@
                               </w:rPr>
                               <w:t xml:space="preserve"> sera exclue </w:t>
                             </w:r>
+                            <w:proofErr w:type="gramStart"/>
                             <w:r>
                               <w:rPr>
                                 <w:spacing w:val="-4"/>
@@ -5341,7 +5244,14 @@
                               <w:rPr>
                                 <w:spacing w:val="-4"/>
                               </w:rPr>
-                              <w:t>meeting.</w:t>
+                              <w:t>meeting</w:t>
+                            </w:r>
+                            <w:proofErr w:type="gramEnd"/>
+                            <w:r>
+                              <w:rPr>
+                                <w:spacing w:val="-4"/>
+                              </w:rPr>
+                              <w:t>.</w:t>
                             </w:r>
                           </w:p>
                           <w:p/>
@@ -5524,6 +5434,7 @@
                         </w:rPr>
                         <w:t xml:space="preserve"> sera exclue </w:t>
                       </w:r>
+                      <w:proofErr w:type="gramStart"/>
                       <w:r>
                         <w:rPr>
                           <w:spacing w:val="-4"/>
@@ -5540,7 +5451,14 @@
                         <w:rPr>
                           <w:spacing w:val="-4"/>
                         </w:rPr>
-                        <w:t>meeting.</w:t>
+                        <w:t>meeting</w:t>
+                      </w:r>
+                      <w:proofErr w:type="gramEnd"/>
+                      <w:r>
+                        <w:rPr>
+                          <w:spacing w:val="-4"/>
+                        </w:rPr>
+                        <w:t>.</w:t>
                       </w:r>
                     </w:p>
                     <w:p/>
@@ -6207,6 +6125,7 @@
                                 </w:rPr>
                                 <w:t xml:space="preserve"> </w:t>
                               </w:r>
+                              <w:proofErr w:type="gramStart"/>
                               <w:r>
                                 <w:rPr>
                                   <w:rFonts w:ascii="Arial" w:hAnsi="Arial"/>
@@ -6218,6 +6137,7 @@
                                 </w:rPr>
                                 <w:t>D’ENGAGEMENT:</w:t>
                               </w:r>
+                              <w:proofErr w:type="gramEnd"/>
                             </w:p>
                             <w:p>
                               <w:pPr>
@@ -7027,6 +6947,7 @@
                           </w:rPr>
                           <w:t xml:space="preserve"> </w:t>
                         </w:r>
+                        <w:proofErr w:type="gramStart"/>
                         <w:r>
                           <w:rPr>
                             <w:rFonts w:ascii="Arial" w:hAnsi="Arial"/>
@@ -7038,6 +6959,7 @@
                           </w:rPr>
                           <w:t>D’ENGAGEMENT:</w:t>
                         </w:r>
+                        <w:proofErr w:type="gramEnd"/>
                       </w:p>
                       <w:p>
                         <w:pPr>
@@ -8065,6 +7987,7 @@
         </w:rPr>
         <w:t xml:space="preserve"> </w:t>
       </w:r>
+      <w:proofErr w:type="gramStart"/>
       <w:r>
         <w:rPr>
           <w:spacing w:val="-2"/>
@@ -8097,6 +8020,7 @@
         </w:rPr>
         <w:t>je</w:t>
       </w:r>
+      <w:proofErr w:type="gramEnd"/>
       <w:r>
         <w:rPr>
           <w:rFonts w:ascii="Arial Black" w:hAnsi="Arial Black"/>
@@ -8309,6 +8233,7 @@
         </w:rPr>
         <w:t xml:space="preserve"> </w:t>
       </w:r>
+      <w:proofErr w:type="gramStart"/>
       <w:r>
         <w:rPr>
           <w:rFonts w:ascii="Arial Black" w:hAnsi="Arial Black"/>
@@ -8318,6 +8243,7 @@
         </w:rPr>
         <w:t>à:</w:t>
       </w:r>
+      <w:proofErr w:type="gramEnd"/>
       <w:r>
         <w:rPr>
           <w:rFonts w:ascii="Arial Black" w:hAnsi="Arial Black"/>
@@ -8669,8 +8595,17 @@
                                   <w:w w:val="105"/>
                                   <w:sz w:val="20"/>
                                 </w:rPr>
-                                <w:t>N°:</w:t>
-                              </w:r>
+                                <w:t>N</w:t>
+                              </w:r>
+                              <w:proofErr w:type="gramStart"/>
+                              <w:r>
+                                <w:rPr>
+                                  <w:w w:val="105"/>
+                                  <w:sz w:val="20"/>
+                                </w:rPr>
+                                <w:t>°:</w:t>
+                              </w:r>
+                              <w:proofErr w:type="gramEnd"/>
                             </w:p>
                           </w:txbxContent>
                         </wps:txbx>
@@ -8887,8 +8822,17 @@
                             <w:w w:val="105"/>
                             <w:sz w:val="20"/>
                           </w:rPr>
-                          <w:t>N°:</w:t>
-                        </w:r>
+                          <w:t>N</w:t>
+                        </w:r>
+                        <w:proofErr w:type="gramStart"/>
+                        <w:r>
+                          <w:rPr>
+                            <w:w w:val="105"/>
+                            <w:sz w:val="20"/>
+                          </w:rPr>
+                          <w:t>°:</w:t>
+                        </w:r>
+                        <w:proofErr w:type="gramEnd"/>
                       </w:p>
                     </w:txbxContent>
                   </v:textbox>

</xml_diff>